<commit_message>
Add 介護両立支援制度 system details table (5 systems with requirements)
https://claude.ai/code/session_01RjnsLS9sESzvR353WZNEvY
</commit_message>
<xml_diff>
--- a/介護離職防止支援コース_概要まとめ.docx
+++ b/介護離職防止支援コース_概要まとめ.docx
@@ -426,6 +426,335 @@
           <w:sz w:val="24"/>
         </w:rPr>
         <w:t>② 介護両立支援制度</w:t>
+      </w:r>
+    </w:p>
+    <w:p>
+      <w:pPr>
+        <w:spacing w:before="80" w:after="40"/>
+      </w:pPr>
+      <w:r>
+        <w:rPr>
+          <w:b/>
+          <w:color w:val="2E74B5"/>
+          <w:sz w:val="21"/>
+        </w:rPr>
+        <w:t>■ 導入できる制度（5種）と利用要件</w:t>
+      </w:r>
+    </w:p>
+    <w:tbl>
+      <w:tblPr>
+        <w:tblStyle w:val="TableGrid"/>
+        <w:tblW w:type="auto" w:w="0"/>
+        <w:tblLook w:firstColumn="1" w:firstRow="1" w:lastColumn="0" w:lastRow="0" w:noHBand="0" w:noVBand="1" w:val="04A0"/>
+      </w:tblPr>
+      <w:tblGrid>
+        <w:gridCol w:w="3135"/>
+        <w:gridCol w:w="3135"/>
+        <w:gridCol w:w="3135"/>
+      </w:tblGrid>
+      <w:tr>
+        <w:tc>
+          <w:tcPr>
+            <w:tcW w:type="dxa" w:w="1701"/>
+            <w:shd w:val="clear" w:color="auto" w:fill="2E74B5"/>
+          </w:tcPr>
+          <w:p>
+            <w:r>
+              <w:rPr>
+                <w:b/>
+                <w:color w:val="FFFFFF"/>
+                <w:sz w:val="20"/>
+              </w:rPr>
+              <w:t>制度名</w:t>
+            </w:r>
+          </w:p>
+        </w:tc>
+        <w:tc>
+          <w:tcPr>
+            <w:tcW w:type="dxa" w:w="3685"/>
+            <w:shd w:val="clear" w:color="auto" w:fill="2E74B5"/>
+          </w:tcPr>
+          <w:p>
+            <w:r>
+              <w:rPr>
+                <w:b/>
+                <w:color w:val="FFFFFF"/>
+                <w:sz w:val="20"/>
+              </w:rPr>
+              <w:t>内容</w:t>
+            </w:r>
+          </w:p>
+        </w:tc>
+        <w:tc>
+          <w:tcPr>
+            <w:tcW w:type="dxa" w:w="3685"/>
+            <w:shd w:val="clear" w:color="auto" w:fill="2E74B5"/>
+          </w:tcPr>
+          <w:p>
+            <w:r>
+              <w:rPr>
+                <w:b/>
+                <w:color w:val="FFFFFF"/>
+                <w:sz w:val="20"/>
+              </w:rPr>
+              <w:t>利用要件</w:t>
+            </w:r>
+          </w:p>
+        </w:tc>
+      </w:tr>
+      <w:tr>
+        <w:tc>
+          <w:tcPr>
+            <w:tcW w:type="dxa" w:w="1701"/>
+            <w:shd w:val="clear" w:color="auto" w:fill="DEEAF1"/>
+          </w:tcPr>
+          <w:p>
+            <w:r>
+              <w:rPr>
+                <w:sz w:val="19"/>
+              </w:rPr>
+              <w:t>時差出勤制度</w:t>
+            </w:r>
+          </w:p>
+        </w:tc>
+        <w:tc>
+          <w:tcPr>
+            <w:tcW w:type="dxa" w:w="3685"/>
+            <w:shd w:val="clear" w:color="auto" w:fill="DEEAF1"/>
+          </w:tcPr>
+          <w:p>
+            <w:r>
+              <w:rPr>
+                <w:sz w:val="19"/>
+              </w:rPr>
+              <w:t>1日の所定労働時間を変えずに、始業または終業の時刻を1時間以上繰り上げ・繰り下げる制度</w:t>
+            </w:r>
+          </w:p>
+        </w:tc>
+        <w:tc>
+          <w:tcPr>
+            <w:tcW w:type="dxa" w:w="3685"/>
+            <w:shd w:val="clear" w:color="auto" w:fill="DEEAF1"/>
+          </w:tcPr>
+          <w:p>
+            <w:r>
+              <w:rPr>
+                <w:sz w:val="19"/>
+              </w:rPr>
+              <w:t>所定労働日ベースで合計20日間以上の利用実績</w:t>
+              <w:br/>
+              <w:t>（制度利用開始前1か月間に当該制度を利用していないこと）</w:t>
+            </w:r>
+          </w:p>
+        </w:tc>
+      </w:tr>
+      <w:tr>
+        <w:tc>
+          <w:tcPr>
+            <w:tcW w:type="dxa" w:w="1701"/>
+          </w:tcPr>
+          <w:p>
+            <w:r>
+              <w:rPr>
+                <w:sz w:val="19"/>
+              </w:rPr>
+              <w:t>短時間勤務制度</w:t>
+              <w:br/>
+              <w:t>（介護のため）</w:t>
+            </w:r>
+          </w:p>
+        </w:tc>
+        <w:tc>
+          <w:tcPr>
+            <w:tcW w:type="dxa" w:w="3685"/>
+          </w:tcPr>
+          <w:p>
+            <w:r>
+              <w:rPr>
+                <w:sz w:val="19"/>
+              </w:rPr>
+              <w:t>1日の所定労働時間を1時間以上短縮する制度</w:t>
+              <w:br/>
+              <w:t>（週の一部のみ短縮も可）</w:t>
+            </w:r>
+          </w:p>
+        </w:tc>
+        <w:tc>
+          <w:tcPr>
+            <w:tcW w:type="dxa" w:w="3685"/>
+          </w:tcPr>
+          <w:p>
+            <w:r>
+              <w:rPr>
+                <w:sz w:val="19"/>
+              </w:rPr>
+              <w:t>所定労働日ベースで合計20日間以上</w:t>
+              <w:br/>
+              <w:t>時間当たり基本給等が制度利用前を下回らないこと</w:t>
+              <w:br/>
+              <w:t>無期雇用労働者が利用中に有期に変更されていないこと</w:t>
+            </w:r>
+          </w:p>
+        </w:tc>
+      </w:tr>
+      <w:tr>
+        <w:tc>
+          <w:tcPr>
+            <w:tcW w:type="dxa" w:w="1701"/>
+            <w:shd w:val="clear" w:color="auto" w:fill="DEEAF1"/>
+          </w:tcPr>
+          <w:p>
+            <w:r>
+              <w:rPr>
+                <w:sz w:val="19"/>
+              </w:rPr>
+              <w:t>在宅勤務制度</w:t>
+              <w:br/>
+              <w:t>（介護のため）</w:t>
+            </w:r>
+          </w:p>
+        </w:tc>
+        <w:tc>
+          <w:tcPr>
+            <w:tcW w:type="dxa" w:w="3685"/>
+            <w:shd w:val="clear" w:color="auto" w:fill="DEEAF1"/>
+          </w:tcPr>
+          <w:p>
+            <w:r>
+              <w:rPr>
+                <w:sz w:val="19"/>
+              </w:rPr>
+              <w:t>要介護状態の対象家族を介護しながら就業できるよう、在宅勤務を認める制度</w:t>
+            </w:r>
+          </w:p>
+        </w:tc>
+        <w:tc>
+          <w:tcPr>
+            <w:tcW w:type="dxa" w:w="3685"/>
+            <w:shd w:val="clear" w:color="auto" w:fill="DEEAF1"/>
+          </w:tcPr>
+          <w:p>
+            <w:r>
+              <w:rPr>
+                <w:sz w:val="19"/>
+              </w:rPr>
+              <w:t>所定労働日ベースで合計20日間以上</w:t>
+              <w:br/>
+              <w:t>業務日報等で勤務実態（勤務日・始終業時刻）が確認できること</w:t>
+              <w:br/>
+              <w:t>制度利用前1か月間に週2割以上または通算5回以上の在宅勤務実績がないこと</w:t>
+            </w:r>
+          </w:p>
+        </w:tc>
+      </w:tr>
+      <w:tr>
+        <w:tc>
+          <w:tcPr>
+            <w:tcW w:type="dxa" w:w="1701"/>
+          </w:tcPr>
+          <w:p>
+            <w:r>
+              <w:rPr>
+                <w:sz w:val="19"/>
+              </w:rPr>
+              <w:t>フレックスタイム制度</w:t>
+              <w:br/>
+              <w:t>（介護のため）</w:t>
+            </w:r>
+          </w:p>
+        </w:tc>
+        <w:tc>
+          <w:tcPr>
+            <w:tcW w:type="dxa" w:w="3685"/>
+          </w:tcPr>
+          <w:p>
+            <w:r>
+              <w:rPr>
+                <w:sz w:val="19"/>
+              </w:rPr>
+              <w:t>介護休業をしていない労働者が申し出により利用できるフレックスタイム制</w:t>
+            </w:r>
+          </w:p>
+        </w:tc>
+        <w:tc>
+          <w:tcPr>
+            <w:tcW w:type="dxa" w:w="3685"/>
+          </w:tcPr>
+          <w:p>
+            <w:r>
+              <w:rPr>
+                <w:sz w:val="19"/>
+              </w:rPr>
+              <w:t>所定労働日ベースで合計20日間以上</w:t>
+              <w:br/>
+              <w:t>介護のために利用したことが確認できること</w:t>
+            </w:r>
+          </w:p>
+        </w:tc>
+      </w:tr>
+      <w:tr>
+        <w:tc>
+          <w:tcPr>
+            <w:tcW w:type="dxa" w:w="1701"/>
+            <w:shd w:val="clear" w:color="auto" w:fill="DEEAF1"/>
+          </w:tcPr>
+          <w:p>
+            <w:r>
+              <w:rPr>
+                <w:sz w:val="19"/>
+              </w:rPr>
+              <w:t>介護サービス費用</w:t>
+              <w:br/>
+              <w:t>補助制度</w:t>
+            </w:r>
+          </w:p>
+        </w:tc>
+        <w:tc>
+          <w:tcPr>
+            <w:tcW w:type="dxa" w:w="3685"/>
+            <w:shd w:val="clear" w:color="auto" w:fill="DEEAF1"/>
+          </w:tcPr>
+          <w:p>
+            <w:r>
+              <w:rPr>
+                <w:sz w:val="19"/>
+              </w:rPr>
+              <w:t>対象家族の介護サービス費用の全部または一部を事業主が補助する制度</w:t>
+            </w:r>
+          </w:p>
+        </w:tc>
+        <w:tc>
+          <w:tcPr>
+            <w:tcW w:type="dxa" w:w="3685"/>
+            <w:shd w:val="clear" w:color="auto" w:fill="DEEAF1"/>
+          </w:tcPr>
+          <w:p>
+            <w:r>
+              <w:rPr>
+                <w:sz w:val="19"/>
+              </w:rPr>
+              <w:t>制度利用開始日から6か月以内に、労働者負担額の5割相当以上または10万円以上を補助すること</w:t>
+            </w:r>
+          </w:p>
+        </w:tc>
+      </w:tr>
+    </w:tbl>
+    <w:p>
+      <w:pPr>
+        <w:spacing w:after="80"/>
+      </w:pPr>
+    </w:p>
+    <w:p>
+      <w:pPr>
+        <w:spacing w:before="80" w:after="40"/>
+      </w:pPr>
+      <w:r>
+        <w:rPr>
+          <w:b/>
+          <w:color w:val="2E74B5"/>
+          <w:sz w:val="21"/>
+        </w:rPr>
+        <w:t>■ 支給額</w:t>
       </w:r>
     </w:p>
     <w:tbl>

</xml_diff>